<commit_message>
fix bug with a S1 test
</commit_message>
<xml_diff>
--- a/out/manuscript.docx
+++ b/out/manuscript.docx
@@ -21,7 +21,7 @@
         <w:pStyle w:val="Datum"/>
       </w:pPr>
       <w:r>
-        <w:t xml:space="preserve">2025-12-15</w:t>
+        <w:t xml:space="preserve">2025-12-17</w:t>
       </w:r>
     </w:p>
     <w:p>
@@ -190,7 +190,7 @@
         <w:t xml:space="preserve"> </w:t>
       </w:r>
       <w:r>
-        <w:t xml:space="preserve">= 0.92, t(1012) = 75.59, p = &lt; .001). The high correlation between perceived difficulty and true difficultyis visible in Figure</w:t>
+        <w:t xml:space="preserve">= 0.45, t(911.69) = 22.18, p = &lt; .001). The high correlation between perceived difficulty and true difficultyis visible in Figure</w:t>
       </w:r>
       <w:r>
         <w:t xml:space="preserve"> </w:t>

</xml_diff>

<commit_message>
write up confirmatory analyses
</commit_message>
<xml_diff>
--- a/out/manuscript.docx
+++ b/out/manuscript.docx
@@ -21,7 +21,7 @@
         <w:pStyle w:val="Datum"/>
       </w:pPr>
       <w:r>
-        <w:t xml:space="preserve">2025-12-17</w:t>
+        <w:t xml:space="preserve">2025-12-18</w:t>
       </w:r>
     </w:p>
     <w:p>
@@ -80,13 +80,7 @@
         <w:pStyle w:val="Textkrper"/>
       </w:pPr>
       <w:r>
-        <w:t xml:space="preserve">Participants, given a single piece of information that another person got a particular arithmetic question right/wrong, were far better than chance at judging which other questions that person would have got right.</w:t>
-      </w:r>
-      <w:r>
-        <w:t xml:space="preserve"> </w:t>
-      </w:r>
-      <w:r>
-        <w:t xml:space="preserve">This inference about the competence of others from very limited information relies on the participants assuming that performance on the arithmetic questions is nested, with people who can answer harder questions also being able to answer easier ones, but not vice-versa. In order to make use of the nestnessness of the questions, participants additionally needed to accurately assess the the rarity of reaching a correct answer in the time limit for different questions, in other words the difficulty of the questions. Our findings suggest that participants were on average able to make all of these judgments, enabling their successful competence inferences.</w:t>
+        <w:t xml:space="preserve">Participants, given a single piece of information that another person got a particular arithmetic question right/wrong, were far better than chance at judging which other questions that person would have got right. This inference about the competence of others from very limited information relies on the participants assuming that performance on the arithmetic questions is nested, with people who can answer harder questions also being able to answer easier ones, but not vice-versa. In order to make use of the nestnessness of the questions, participants additionally needed to accurately assess the the rarity of reaching a correct answer in the time limit for different questions, in other words the difficulty of the questions. Our findings suggest that participants were on average able to make all of these judgments, enabling their successful competence inferences.</w:t>
       </w:r>
     </w:p>
     <w:p>
@@ -451,7 +445,7 @@
       </w:r>
     </w:p>
     <w:bookmarkEnd w:id="24"/>
-    <w:bookmarkStart w:id="29" w:name="Xa6a89cdd8e6a525baf9b252b970771db62075c2"/>
+    <w:bookmarkStart w:id="30" w:name="Xa6a89cdd8e6a525baf9b252b970771db62075c2"/>
     <w:p>
       <w:pPr>
         <w:pStyle w:val="berschrift2"/>
@@ -857,13 +851,7 @@
         <w:t xml:space="preserve">H3</w:t>
       </w:r>
       <w:r>
-        <w:t xml:space="preserve">, we fit three linear models to compare the Main Model’s and the two heuristic models’ fit with participants’ answers, as well as how much variance in participant behaviour they explained. We found that our Main Model</w:t>
-      </w:r>
-      <w:r>
-        <w:t xml:space="preserve"> </w:t>
-      </w:r>
-      <w:r>
-        <w:t xml:space="preserve">was very strongly correlated with participant behaviour (</w:t>
+        <w:t xml:space="preserve">, we fit three linear models to compare the Main Model’s and the two heuristic models’ fit with participants’ answers, as well as how much variance in participant behaviour they explained. We found that our Main Model was very strongly correlated with participant behaviour (</w:t>
       </w:r>
       <m:oMath>
         <m:r>
@@ -982,7 +970,7 @@
     </w:p>
     <w:p>
       <w:pPr>
-        <w:pStyle w:val="Textkrper"/>
+        <w:pStyle w:val="CaptionedFigure"/>
       </w:pPr>
       <w:r>
         <w:drawing>
@@ -1026,9 +1014,31 @@
           </wp:inline>
         </w:drawing>
       </w:r>
-      <w:r>
-        <w:t xml:space="preserve"> </w:t>
-      </w:r>
+    </w:p>
+    <w:p>
+      <w:pPr>
+        <w:pStyle w:val="ImageCaption"/>
+      </w:pPr>
+      <w:bookmarkStart w:id="28" w:name="fig:S1-fig-model-comparison"/>
+      <w:bookmarkEnd w:id="28"/>
+      <w:r>
+        <w:rPr>
+          <w:i/>
+          <w:iCs/>
+        </w:rPr>
+        <w:t xml:space="preserve">Figure</w:t>
+      </w:r>
+      <w:r>
+        <w:t xml:space="preserve"> </w:t>
+      </w:r>
+      <w:r>
+        <w:t xml:space="preserve">2. Model comparison. Each data point is a pair of two questions.</w:t>
+      </w:r>
+    </w:p>
+    <w:p>
+      <w:pPr>
+        <w:pStyle w:val="Textkrper"/>
+      </w:pPr>
       <w:r>
         <w:t xml:space="preserve">To test</w:t>
       </w:r>
@@ -1233,8 +1243,8 @@
       <w:pPr>
         <w:pStyle w:val="TableCaption"/>
       </w:pPr>
-      <w:bookmarkStart w:id="28" w:name="tab:S1-table"/>
-      <w:bookmarkEnd w:id="28"/>
+      <w:bookmarkStart w:id="29" w:name="tab:S1-table"/>
+      <w:bookmarkEnd w:id="29"/>
       <w:r>
         <w:t xml:space="preserve">Table 1:</w:t>
       </w:r>
@@ -4723,8 +4733,8 @@
         </w:tc>
       </w:tr>
     </w:tbl>
-    <w:bookmarkEnd w:id="29"/>
-    <w:bookmarkStart w:id="34" w:name="exploratory-analysis"/>
+    <w:bookmarkEnd w:id="30"/>
+    <w:bookmarkStart w:id="35" w:name="exploratory-analysis"/>
     <w:p>
       <w:pPr>
         <w:pStyle w:val="berschrift2"/>
@@ -4851,18 +4861,18 @@
           <wp:inline>
             <wp:extent cx="5969000" cy="3686568"/>
             <wp:effectExtent b="0" l="0" r="0" t="0"/>
-            <wp:docPr descr="Figure 3: Estimated Conditional Probability versus True Conditional Probability. Each data point is a pair of two questions.The red line represents the optimal prediction while the dark line represents the fit of the linear models." title="" id="31" name="Picture"/>
+            <wp:docPr descr="Figure 3: Estimated Conditional Probability versus True Conditional Probability. Each data point is a pair of two questions.The red line represents the optimal prediction while the dark line represents the fit of the linear models." title="" id="32" name="Picture"/>
             <a:graphic>
               <a:graphicData uri="http://schemas.openxmlformats.org/drawingml/2006/picture">
                 <pic:pic>
                   <pic:nvPicPr>
-                    <pic:cNvPr descr="figures/S1-fig-behav-2-1.png" id="32" name="Picture"/>
+                    <pic:cNvPr descr="figures/S1-fig-behav-2-1.png" id="33" name="Picture"/>
                     <pic:cNvPicPr>
                       <a:picLocks noChangeArrowheads="1" noChangeAspect="1"/>
                     </pic:cNvPicPr>
                   </pic:nvPicPr>
                   <pic:blipFill>
-                    <a:blip r:embed="rId30"/>
+                    <a:blip r:embed="rId31"/>
                     <a:stretch>
                       <a:fillRect/>
                     </a:stretch>
@@ -4893,8 +4903,8 @@
       <w:pPr>
         <w:pStyle w:val="ImageCaption"/>
       </w:pPr>
-      <w:bookmarkStart w:id="33" w:name="fig:S1-fig-behav-2"/>
-      <w:bookmarkEnd w:id="33"/>
+      <w:bookmarkStart w:id="34" w:name="fig:S1-fig-behav-2"/>
+      <w:bookmarkEnd w:id="34"/>
       <w:r>
         <w:rPr>
           <w:i/>
@@ -5069,8 +5079,8 @@
         <w:t xml:space="preserve">= 80.86 ± 19.80; t(216) = -10.84, p &lt; .001, paired t-test). The Bayesian model was the best model for 72% of participants whereas the Heuristic 1 accounted for 6% and the Heuristic 2 accounted for 21%.</w:t>
       </w:r>
     </w:p>
-    <w:bookmarkEnd w:id="34"/>
-    <w:bookmarkStart w:id="35" w:name="exploring-response-time-data"/>
+    <w:bookmarkEnd w:id="35"/>
+    <w:bookmarkStart w:id="36" w:name="exploring-response-time-data"/>
     <w:p>
       <w:pPr>
         <w:pStyle w:val="berschrift2"/>
@@ -5298,8 +5308,8 @@
         <w:t xml:space="preserve">Finally, we fit another mixed-effects logistic regression to investigate whether response time on a question predicted accuracy on that question across participants and items. Here we found that response time had a significant negative effect on accuracy (β = -0.104, p &lt; .001), indicating that longer response times were associated with lower accuracy. Converting from log-odds, each one-second increase in response time corresponded to a 9.88% decrease in the odds of answering correctly.</w:t>
       </w:r>
     </w:p>
-    <w:bookmarkEnd w:id="35"/>
-    <w:bookmarkStart w:id="37" w:name="study-2"/>
+    <w:bookmarkEnd w:id="36"/>
+    <w:bookmarkStart w:id="38" w:name="study-2"/>
     <w:p>
       <w:pPr>
         <w:pStyle w:val="berschrift1"/>
@@ -5308,7 +5318,7 @@
         <w:t xml:space="preserve">Study 2</w:t>
       </w:r>
     </w:p>
-    <w:bookmarkStart w:id="36" w:name="confirmatory-analyses"/>
+    <w:bookmarkStart w:id="37" w:name="confirmatory-analyses"/>
     <w:p>
       <w:pPr>
         <w:pStyle w:val="berschrift2"/>
@@ -5322,14 +5332,10 @@
         <w:pStyle w:val="FirstParagraph"/>
       </w:pPr>
       <w:r>
-        <w:rPr>
-          <w:b/>
-          <w:bCs/>
-        </w:rPr>
-        <w:t xml:space="preserve">H1</w:t>
-      </w:r>
-      <w:r>
-        <w:t xml:space="preserve">: Participants can accurately assess the difficulty of correctly answering the observed questions (</w:t>
+        <w:t xml:space="preserve">We first tested if participants were able to assess the difficulty of correctly answering the observed questions. We collected judgement of difficulty on the quiz 2 questions only as quiz 1 were materials from the first study. The analysis is not subdivided by time condition: both in the judgement phase and in the questionnaire phase, participants were presented with each condition half the time. A linear mixed effect model with random slope and intercept for participants showed that participants’ estimations correctly tracked the difficulty of answering each question (H1:</w:t>
+      </w:r>
+      <w:r>
+        <w:t xml:space="preserve"> </w:t>
       </w:r>
       <m:oMath>
         <m:r>
@@ -5348,14 +5354,10 @@
         <w:pStyle w:val="Textkrper"/>
       </w:pPr>
       <w:r>
-        <w:rPr>
-          <w:b/>
-          <w:bCs/>
-        </w:rPr>
-        <w:t xml:space="preserve">H2a</w:t>
-      </w:r>
-      <w:r>
-        <w:t xml:space="preserve">: For a given pair of Quiz 1 and Quiz 2 questions, among participants who correctly answered the Quiz 2 question, those who answered under a 20-second time limit have a higher chance of answering the Quiz 1 question than those who answered under a 40-second time limit (b = 0.51, z = 2.15, p = 0.031).</w:t>
+        <w:t xml:space="preserve">To determine if the time condition in Quiz 2 provided information about the probability of answering correctly a question of the Quiz 1, we created pairs of Quiz 1 and Quiz 2 questions (e.g Q1.1-Q2.1, Q1.1-Q.2.2, etc.) from participants’ answers. Note that this mirror the structure of the judgement phase: while H2a and H2b test if the time condition provide information (for correct and incorrect questions respectively), H4a and H4b test if participants rely on the time condition when making a judgement. We ran two logits mixed-effect models: one among participants who answered a given Quiz 2 question correctly and one among those who answered it incorrectly. In both models, the dependent variable was a binary variable coding if the question from Q1 was correctly answered and the independent variable was a factor coding if the Q2 question was solved (H2a) or failed (H2b) under the Fast or the Slow condition. We controlled for the specific pair with a random effect (therefore comparing for the same pair, the effect of solving/failing under the fast condition compared to the slow), the model also include random intercepts for participants. H2a was restricted to trials where the Q2 question was solved and H2b was restricted to trials where the Q2 question was failed. We found that for a given pair of Quiz 1 and Quiz 2 questions, among participants who correctly answered the Quiz 2 question, those who answered under a 20-second time limit have a higher chance of answering the Quiz 1 question than those who answered under a 40-second time limit (H2a: b = 0.51, z = 2.15, p = 0.031). Among participants who failed the Quiz 2 question, those who failed under a 20-second time limit also had a higher chance of answering the Quiz 1 question compared to those who failed under a 40-second time limit (H2b: b = 0.71, z = 2.63, p = 0.009). This indicate that, no matters the outcome on the Quiz 2 question, participants should attribute higher chance of success to participants in the Fast condition, although the effect is relatively small.</w:t>
+      </w:r>
+      <w:r>
+        <w:br/>
       </w:r>
     </w:p>
     <w:p>
@@ -5363,29 +5365,10 @@
         <w:pStyle w:val="Textkrper"/>
       </w:pPr>
       <w:r>
-        <w:rPr>
-          <w:b/>
-          <w:bCs/>
-        </w:rPr>
-        <w:t xml:space="preserve">H2b</w:t>
-      </w:r>
-      <w:r>
-        <w:t xml:space="preserve">: For a given pair of Quiz 1 and Quiz 2 questions, among participants who failed the Quiz 2 question, those who failed under a 20-second time limit have a higher chance of answering the Quiz 1 question than those who failed under a 40-second time limit (b = 0.71, z = 2.63, p = 0.009).</w:t>
-      </w:r>
-    </w:p>
-    <w:p>
-      <w:pPr>
-        <w:pStyle w:val="Textkrper"/>
-      </w:pPr>
-      <w:r>
-        <w:rPr>
-          <w:b/>
-          <w:bCs/>
-        </w:rPr>
-        <w:t xml:space="preserve">H3</w:t>
-      </w:r>
-      <w:r>
-        <w:t xml:space="preserve">: On average, participants’ predictions of the probabilities of success on different evaluated questions, given success or failure within the 20 second or 40 second time limit on an observed question, are significantly correlated with true conditional probabilities (</w:t>
+        <w:t xml:space="preserve">We replicated the analysis of study 1 and found that, on average, participants’ predictions of the probabilities of success on different evaluated questions, given success or failure within the 20 second or 40 second time limit on an observed question, are significantly correlated with true conditional probabilities (H3:</w:t>
+      </w:r>
+      <w:r>
+        <w:t xml:space="preserve"> </w:t>
       </w:r>
       <m:oMath>
         <m:r>
@@ -5419,7 +5402,7 @@
         <w:t xml:space="preserve"> </w:t>
       </w:r>
       <w:r>
-        <w:t xml:space="preserve">= 0.79).</w:t>
+        <w:t xml:space="preserve">= 0.79). Mirroring the analyses of H2a and H2b, we tested if participants took into account the information provided by the time condition when predicting success/failure on evaluated Quiz 1 questions. Similar models than H2a and H2b were estimated, but with participants’ binary predictions as the dependent variable and the observed time condition as the independent variable (still controlling for the pair presented and restricting the analyses among success/failure observed). Results show that participants do not take into account the information provided by the time condition when observing a correct answer under 20 second compared to 40 second (H4a: b = 0.17, z = 1.53, p = 0.125) or when observing an incorrect answer (H4b: b = 0.15, z = 1.62, p = 0.104).</w:t>
       </w:r>
     </w:p>
     <w:p>
@@ -5427,44 +5410,10 @@
         <w:pStyle w:val="Textkrper"/>
       </w:pPr>
       <w:r>
-        <w:rPr>
-          <w:b/>
-          <w:bCs/>
-        </w:rPr>
-        <w:t xml:space="preserve">H4a</w:t>
-      </w:r>
-      <w:r>
-        <w:t xml:space="preserve">: For a given pair of Quiz 1 and Quiz 2 questions, participants’ predictions of the probabilities of success on different evaluated questions will be higher for correctly answered observed questions in under 20 seconds rather than under 40 seconds (b = 0.17, z = 1.53, p = 0.125).</w:t>
-      </w:r>
-    </w:p>
-    <w:p>
-      <w:pPr>
-        <w:pStyle w:val="Textkrper"/>
-      </w:pPr>
-      <w:r>
-        <w:rPr>
-          <w:b/>
-          <w:bCs/>
-        </w:rPr>
-        <w:t xml:space="preserve">H4b</w:t>
-      </w:r>
-      <w:r>
-        <w:t xml:space="preserve">: For a given pair of Quiz 1 and Quiz 2 questions, participants’ predictions of the probabilities of success on different evaluated questions will be higher for incorrectly answered observed questions in under 20 seconds rather than under 40 seconds (b = 0.15, z = 1.62, p = 0.104).</w:t>
-      </w:r>
-    </w:p>
-    <w:p>
-      <w:pPr>
-        <w:pStyle w:val="Textkrper"/>
-      </w:pPr>
-      <w:r>
-        <w:rPr>
-          <w:b/>
-          <w:bCs/>
-        </w:rPr>
-        <w:t xml:space="preserve">H1m</w:t>
-      </w:r>
-      <w:r>
-        <w:t xml:space="preserve">: Even participants with minimal arithmetic ability can, for different observed questions, accurately assess the difficulty of these questions (</w:t>
+        <w:t xml:space="preserve">We further tested if our results for H1 and H3 were robust when testing predictions of participants with minimal arithmetic ability (defined as the bottom 30% score in the questionnaire). Participants with minimal arithmetic ability can both accurately predict the difficulty of each question (H1m:</w:t>
+      </w:r>
+      <w:r>
+        <w:t xml:space="preserve"> </w:t>
       </w:r>
       <m:oMath>
         <m:r>
@@ -5475,22 +5424,10 @@
         <w:t xml:space="preserve"> </w:t>
       </w:r>
       <w:r>
-        <w:t xml:space="preserve">= 0.32, t(88.04) = 8.16, p &lt; .001).</w:t>
-      </w:r>
-    </w:p>
-    <w:p>
-      <w:pPr>
-        <w:pStyle w:val="Textkrper"/>
-      </w:pPr>
-      <w:r>
-        <w:rPr>
-          <w:b/>
-          <w:bCs/>
-        </w:rPr>
-        <w:t xml:space="preserve">H3m</w:t>
-      </w:r>
-      <w:r>
-        <w:t xml:space="preserve">: Even for participants with minimal arithmetic ability, their average predictions of the probabilities of success on different evaluated questions, given success or failure within the 20 second or 40 second time limit on an observed question, are significantly correlated with true conditional probabilities (</w:t>
+        <w:t xml:space="preserve">= 0.32, t(88.04) = 8.16, p &lt; .001) and predict the conditional probabilities of success on evaluated questions (H3m:</w:t>
+      </w:r>
+      <w:r>
+        <w:t xml:space="preserve"> </w:t>
       </w:r>
       <m:oMath>
         <m:r>
@@ -5532,18 +5469,11 @@
         <w:pStyle w:val="Textkrper"/>
       </w:pPr>
       <w:r>
-        <w:rPr>
-          <w:b/>
-          <w:bCs/>
-        </w:rPr>
-        <w:t xml:space="preserve">H3i</w:t>
-      </w:r>
-      <w:r>
-        <w:t xml:space="preserve">: At the trial level, participants’ predictions of the probabilities of success on different evaluated questions, given success or failure within the 20 second or 40 second time limit on an observed question, are significantly correlated with true conditional probabilities (b = 1.95, z = 46.19, p &lt; .001).</w:t>
+        <w:t xml:space="preserve">Moreover, participants’ predictions of the conditional probabilities of success were still correlated with the true probability when analyzed at the trial level (H3i: b = 1.95, z = 46.19, p &lt; .001).</w:t>
       </w:r>
     </w:p>
-    <w:bookmarkEnd w:id="36"/>
     <w:bookmarkEnd w:id="37"/>
+    <w:bookmarkEnd w:id="38"/>
     <w:sectPr>
       <w:headerReference r:id="rId9" w:type="even"/>
       <w:headerReference r:id="rId11" w:type="default"/>

</xml_diff>